<commit_message>
Fix 2024E net income/EPS realism + add top-3 holders
- net income is annualized by a seasonality factor (soft Q4), NOT x4/3: FY2024E NI
  ₱10.6bn (was ₱13.5bn; matches the ~₱10.5bn full-year run-rate). Revenue/EBIT still x4/3,
  so the DCF fair value (₱27.35, NOPAT-based) is unchanged.
- EPS now on a common basis (deducts preferred dividends): ₱3.47→₱4.58, consistent with
  the filing's reported 9M EPS of ₱3.43
- front page: added Major shareholders (Trident 56.9% / public float / Ayala preferred)
- coverage-initiation note; 52-wk range relabeled estimated
- live Excel recalcs to the corrected NI/EPS; examples refreshed

Co-Authored-By: Claude Opus 4.8 <noreply@anthropic.com>
</commit_message>
<xml_diff>
--- a/examples/mwc_research_note.docx
+++ b/examples/mwc_research_note.docx
@@ -170,7 +170,7 @@
                 <w:i w:val="0"/>
                 <w:sz w:val="19"/>
               </w:rPr>
-              <w:t>9M-2024 net income to parent rose to ₱10.10bn from ₱7.26bn, a ~39% increase, driven by a 20% Parent Company average tariff hike and steady billed-volume growth.</w:t>
+              <w:t>9M-2024 net income attributable to parent rose to ₱10.10bn from ₱7.26bn, supported by a 20% average tariff increase and 2% billed volume growth at the Parent Company.</w:t>
             </w:r>
           </w:p>
           <w:p>
@@ -192,7 +192,7 @@
                 <w:i w:val="0"/>
                 <w:sz w:val="19"/>
               </w:rPr>
-              <w:t>Non-East Zone revenues grew 23% on 6% billed-volume growth and 20% tariff increases across several business units, complementing the core Metro Manila East Zone concession.</w:t>
+              <w:t>Non-East Zone revenues grew 23% on 6% billed volume growth and 20% tariff increases across several business units, complementing the core Metro Manila East Zone concession and overseas subsidiaries.</w:t>
             </w:r>
           </w:p>
           <w:p>
@@ -214,7 +214,7 @@
                 <w:i w:val="0"/>
                 <w:sz w:val="19"/>
               </w:rPr>
-              <w:t>Our DCF (WACC 8.4%, terminal growth 2.5%) yields a fair value of ₱27.35 against a price of ₱22.36, implying ~22% upside and an enterprise value of ₱167.9bn.</w:t>
+              <w:t>Our DCF (WACC 8.4%, terminal growth 2.5%) yields a fair value of ₱27.35 versus a current price of ₱22.36, implying roughly 22% upside.</w:t>
             </w:r>
           </w:p>
           <w:p>
@@ -228,7 +228,7 @@
                 <w:i w:val="0"/>
                 <w:sz w:val="19"/>
               </w:rPr>
-              <w:t xml:space="preserve">Scheduled tariff visibility — </w:t>
+              <w:t xml:space="preserve">Visible tariff pathway — </w:t>
             </w:r>
             <w:r>
               <w:rPr>
@@ -236,7 +236,7 @@
                 <w:i w:val="0"/>
                 <w:sz w:val="19"/>
               </w:rPr>
-              <w:t>Contracted adjustments from 2023 to 2027, an indicative 2028 Wawa Bulk Water adjustment, and a rising environmental charge underpin a predictable revenue trajectory.</w:t>
+              <w:t>Scheduled tariff adjustments from 2023 to 2027, an indicative 2028 adjustment for the Wawa Bulk Water Supply Project, and a rising environmental charge underpin medium-term revenue visibility.</w:t>
             </w:r>
           </w:p>
           <w:p>
@@ -258,7 +258,7 @@
                 <w:i w:val="0"/>
                 <w:sz w:val="19"/>
               </w:rPr>
-              <w:t>Enrique Razon's Trident Water acquired the Ayala group's entire stake in 2024 and now holds majority control, with Ayala no longer a related party.</w:t>
+              <w:t>In 2024 the Ayala group sold its entire stake to Enrique Razon's Trident Water, which now holds majority control; Ayala is no longer a related party.</w:t>
             </w:r>
           </w:p>
           <w:p>
@@ -280,7 +280,7 @@
                 <w:i w:val="0"/>
                 <w:sz w:val="19"/>
               </w:rPr>
-              <w:t>The pending application to extend the Revised Concession Agreement term to 2047, aligning with the franchise, would lengthen the asset-life horizon supporting valuation.</w:t>
+              <w:t>The application to extend the Revised Concession Agreement term to 2047, aligning with the Franchise term, would lengthen the asset's contracted life and support long-term cash flow visibility.</w:t>
             </w:r>
           </w:p>
         </w:tc>
@@ -474,6 +474,86 @@
                 <w:sz w:val="18"/>
               </w:rPr>
               <w:t>8.4%</w:t>
+            </w:r>
+          </w:p>
+          <w:p>
+            <w:pPr>
+              <w:spacing w:before="80"/>
+            </w:pPr>
+            <w:r>
+              <w:rPr>
+                <w:b/>
+                <w:i w:val="0"/>
+                <w:color w:val="1F3864"/>
+                <w:sz w:val="20"/>
+              </w:rPr>
+              <w:t>Major shareholders</w:t>
+            </w:r>
+          </w:p>
+          <w:p>
+            <w:pPr>
+              <w:spacing w:after="20"/>
+            </w:pPr>
+            <w:r>
+              <w:rPr>
+                <w:b w:val="0"/>
+                <w:i w:val="0"/>
+                <w:color w:val="595959"/>
+                <w:sz w:val="18"/>
+              </w:rPr>
+              <w:t xml:space="preserve">Trident Water (E. Razon): </w:t>
+            </w:r>
+            <w:r>
+              <w:rPr>
+                <w:b/>
+                <w:i w:val="0"/>
+                <w:sz w:val="18"/>
+              </w:rPr>
+              <w:t>56.9%</w:t>
+            </w:r>
+          </w:p>
+          <w:p>
+            <w:pPr>
+              <w:spacing w:after="20"/>
+            </w:pPr>
+            <w:r>
+              <w:rPr>
+                <w:b w:val="0"/>
+                <w:i w:val="0"/>
+                <w:color w:val="595959"/>
+                <w:sz w:val="18"/>
+              </w:rPr>
+              <w:t xml:space="preserve">Public float: </w:t>
+            </w:r>
+            <w:r>
+              <w:rPr>
+                <w:b/>
+                <w:i w:val="0"/>
+                <w:sz w:val="18"/>
+              </w:rPr>
+              <w:t>~43%</w:t>
+            </w:r>
+          </w:p>
+          <w:p>
+            <w:pPr>
+              <w:spacing w:after="20"/>
+            </w:pPr>
+            <w:r>
+              <w:rPr>
+                <w:b w:val="0"/>
+                <w:i w:val="0"/>
+                <w:color w:val="595959"/>
+                <w:sz w:val="18"/>
+              </w:rPr>
+              <w:t xml:space="preserve">Ayala group: </w:t>
+            </w:r>
+            <w:r>
+              <w:rPr>
+                <w:b/>
+                <w:i w:val="0"/>
+                <w:sz w:val="18"/>
+              </w:rPr>
+              <w:t>preferred only</w:t>
             </w:r>
           </w:p>
         </w:tc>
@@ -716,7 +796,7 @@
                 <w:i w:val="0"/>
                 <w:sz w:val="18"/>
               </w:rPr>
-              <w:t>13,470</w:t>
+              <w:t>10,608</w:t>
             </w:r>
           </w:p>
         </w:tc>
@@ -734,7 +814,7 @@
                 <w:i w:val="0"/>
                 <w:sz w:val="18"/>
               </w:rPr>
-              <w:t>14,817</w:t>
+              <w:t>11,668</w:t>
             </w:r>
           </w:p>
         </w:tc>
@@ -752,7 +832,7 @@
                 <w:i w:val="0"/>
                 <w:sz w:val="18"/>
               </w:rPr>
-              <w:t>16,003</w:t>
+              <w:t>12,602</w:t>
             </w:r>
           </w:p>
         </w:tc>
@@ -770,7 +850,7 @@
                 <w:i w:val="0"/>
                 <w:sz w:val="18"/>
               </w:rPr>
-              <w:t>17,123</w:t>
+              <w:t>13,484</w:t>
             </w:r>
           </w:p>
         </w:tc>
@@ -805,7 +885,7 @@
                 <w:i w:val="0"/>
                 <w:sz w:val="18"/>
               </w:rPr>
-              <w:t>5.19</w:t>
+              <w:t>3.47</w:t>
             </w:r>
           </w:p>
         </w:tc>
@@ -823,7 +903,7 @@
                 <w:i w:val="0"/>
                 <w:sz w:val="18"/>
               </w:rPr>
-              <w:t>5.71</w:t>
+              <w:t>3.88</w:t>
             </w:r>
           </w:p>
         </w:tc>
@@ -841,7 +921,7 @@
                 <w:i w:val="0"/>
                 <w:sz w:val="18"/>
               </w:rPr>
-              <w:t>6.16</w:t>
+              <w:t>4.24</w:t>
             </w:r>
           </w:p>
         </w:tc>
@@ -859,7 +939,7 @@
                 <w:i w:val="0"/>
                 <w:sz w:val="18"/>
               </w:rPr>
-              <w:t>6.59</w:t>
+              <w:t>4.58</w:t>
             </w:r>
           </w:p>
         </w:tc>
@@ -912,7 +992,25 @@
                 <w:i w:val="0"/>
                 <w:sz w:val="18"/>
               </w:rPr>
-              <w:t>+10%</w:t>
+              <w:t>+12%</w:t>
+            </w:r>
+          </w:p>
+        </w:tc>
+        <w:tc>
+          <w:tcPr>
+            <w:tcW w:type="dxa" w:w="1764"/>
+          </w:tcPr>
+          <w:p>
+            <w:pPr>
+              <w:jc w:val="right"/>
+            </w:pPr>
+            <w:r>
+              <w:rPr>
+                <w:b w:val="0"/>
+                <w:i w:val="0"/>
+                <w:sz w:val="18"/>
+              </w:rPr>
+              <w:t>+9%</w:t>
             </w:r>
           </w:p>
         </w:tc>
@@ -931,24 +1029,6 @@
                 <w:sz w:val="18"/>
               </w:rPr>
               <w:t>+8%</w:t>
-            </w:r>
-          </w:p>
-        </w:tc>
-        <w:tc>
-          <w:tcPr>
-            <w:tcW w:type="dxa" w:w="1764"/>
-          </w:tcPr>
-          <w:p>
-            <w:pPr>
-              <w:jc w:val="right"/>
-            </w:pPr>
-            <w:r>
-              <w:rPr>
-                <w:b w:val="0"/>
-                <w:i w:val="0"/>
-                <w:sz w:val="18"/>
-              </w:rPr>
-              <w:t>+7%</w:t>
             </w:r>
           </w:p>
         </w:tc>
@@ -2106,6 +2186,20 @@
       </w:tr>
     </w:tbl>
     <w:p>
+      <w:pPr>
+        <w:spacing w:before="80" w:after="40"/>
+      </w:pPr>
+      <w:r>
+        <w:rPr>
+          <w:b w:val="0"/>
+          <w:i w:val="0"/>
+          <w:color w:val="595959"/>
+          <w:sz w:val="16"/>
+        </w:rPr>
+        <w:t>Coverage initiation — no prior estimates shown for a previous-vs-current comparison.</w:t>
+      </w:r>
+    </w:p>
+    <w:p>
       <w:r>
         <w:drawing>
           <wp:inline xmlns:a="http://schemas.openxmlformats.org/drawingml/2006/main" xmlns:pic="http://schemas.openxmlformats.org/drawingml/2006/picture">
@@ -2173,7 +2267,7 @@
           <w:i w:val="0"/>
           <w:sz w:val="20"/>
         </w:rPr>
-        <w:t>For 9M-2024, Manila Water reported revenue of ₱27.5bn versus ₱23.1bn a year earlier, while net income attributable to parent rose to ₱10.10bn from ₱7.26bn, translating to 9M EPS of ₱3.43. Q3-2024 net income to parent reached ₱3.19bn against ₱2.21bn. Growth was led by a 20% Parent Company average tariff increase, 2% billed-volume growth, and a 23% rise in Non-East Zone revenues, partly offset by higher personnel, premises, and regulatory-related costs.</w:t>
+        <w:t>For 9M-2024, Manila Water reported revenue of ₱27.5bn, up from ₱23.1bn, while net income attributable to parent rose to ₱10.10bn from ₱7.26bn, yielding 9M EPS of ₱3.43. Q3-2024 net income to parent reached ₱3.19bn versus ₱2.21bn. Growth was driven by a 20% Parent Company tariff increase, 2% billed volume growth, and a 23% rise in Non-East Zone revenues, partly offset by higher personnel, premises, and other operating costs.</w:t>
       </w:r>
     </w:p>
     <w:p>
@@ -2203,7 +2297,7 @@
           <w:i w:val="0"/>
           <w:sz w:val="20"/>
         </w:rPr>
-        <w:t>Philippine regulated water utilities operate under long-dated concession and franchise frameworks featuring periodic, regulator-approved tariff resets that support cash-flow predictability. Sector demand is underpinned by urbanization, network expansion, and growing sewerage-coverage mandates, while capital intensity remains high. Operators face exposure to supply variability from weather patterns such as El Niño, alongside power, chemical, and inflation-linked cost pressures.</w:t>
+        <w:t>Philippine water utilities operate under long-term concession and franchise frameworks with periodic regulator-approved tariff adjustments, providing relatively stable, inflation-linked cash flows. Sector returns hinge on capital-intensive investment in supply security, sewerage expansion, and service coverage. Operators face exposure to weather variability, including El Niño-driven supply risk, and to evolving regulatory and environmental compliance obligations across both metropolitan and provincial service areas.</w:t>
       </w:r>
     </w:p>
     <w:p>
@@ -2233,7 +2327,7 @@
           <w:i w:val="0"/>
           <w:sz w:val="20"/>
         </w:rPr>
-        <w:t>We expect earnings to be supported by scheduled tariff adjustments running through 2027 and an indicative 2028 adjustment tied to the Wawa Bulk Water Supply Project. The environmental charge rises from 25% to 30% beginning January 2026, with a sewer-charge increase contingent on attaining 30% sewer coverage by end-2025. The pending concession-term extension to 2047 is a key catalyst, while capital expenditures are to be funded through internally generated funds and debt.</w:t>
+        <w:t>We expect continued earnings growth, underpinned by scheduled tariff adjustments through 2027 and an indicative January 2028 adjustment for the Wawa Bulk Water Supply Project. The environmental charge rises from 25% to 30% from January 2026, with a sewer charge increase contingent on attaining 30% sewer coverage by end-2025. Capital expenditures will be financed by internally generated funds and debt. The proposed concession extension to 2047 represents a key structural catalyst.</w:t>
       </w:r>
     </w:p>
     <w:p>
@@ -2356,7 +2450,7 @@
           <w:i w:val="0"/>
           <w:sz w:val="19"/>
         </w:rPr>
-        <w:t>Delays or unfavorable outcomes in tariff approvals or the concession-extension application could compress revenue and valuation.</w:t>
+        <w:t>Tariff adjustments and the proposed concession extension to 2047 remain subject to regulatory approval, creating uncertainty over timing and quantum.</w:t>
       </w:r>
     </w:p>
     <w:p>
@@ -2369,7 +2463,7 @@
           <w:i w:val="0"/>
           <w:sz w:val="19"/>
         </w:rPr>
-        <w:t xml:space="preserve">Supply risk — </w:t>
+        <w:t xml:space="preserve">Supply and weather risk — </w:t>
       </w:r>
       <w:r>
         <w:rPr>
@@ -2377,7 +2471,7 @@
           <w:i w:val="0"/>
           <w:sz w:val="19"/>
         </w:rPr>
-        <w:t>Severe El Niño or drought conditions could constrain raw-water availability and pressure service reliability despite alternative-supply investments.</w:t>
+        <w:t>Severe El Niño conditions could strain raw water availability despite efforts to bolster alternative supply sources.</w:t>
       </w:r>
     </w:p>
     <w:p>
@@ -2398,7 +2492,7 @@
           <w:i w:val="0"/>
           <w:sz w:val="19"/>
         </w:rPr>
-        <w:t>Rising personnel, premises, power, chemical, and regulatory costs may erode margins if not offset by tariff recovery.</w:t>
+        <w:t>Rising personnel, premises, regulatory, and management fee costs could compress margins if not offset by tariff and volume growth.</w:t>
       </w:r>
     </w:p>
     <w:p>
@@ -2419,7 +2513,7 @@
           <w:i w:val="0"/>
           <w:sz w:val="19"/>
         </w:rPr>
-        <w:t>The change of control to Trident Water introduces uncertainty around strategy, governance, and capital allocation.</w:t>
+        <w:t>The change in majority control to Trident Water introduces uncertainty around strategy, governance, and capital allocation.</w:t>
       </w:r>
     </w:p>
     <w:p>
@@ -3121,7 +3215,7 @@
                 <w:i w:val="0"/>
                 <w:sz w:val="18"/>
               </w:rPr>
-              <w:t>13,470</w:t>
+              <w:t>10,608</w:t>
             </w:r>
           </w:p>
         </w:tc>
@@ -3139,7 +3233,7 @@
                 <w:i w:val="0"/>
                 <w:sz w:val="18"/>
               </w:rPr>
-              <w:t>14,817</w:t>
+              <w:t>11,668</w:t>
             </w:r>
           </w:p>
         </w:tc>
@@ -3157,7 +3251,7 @@
                 <w:i w:val="0"/>
                 <w:sz w:val="18"/>
               </w:rPr>
-              <w:t>16,003</w:t>
+              <w:t>12,602</w:t>
             </w:r>
           </w:p>
         </w:tc>
@@ -3175,7 +3269,7 @@
                 <w:i w:val="0"/>
                 <w:sz w:val="18"/>
               </w:rPr>
-              <w:t>17,123</w:t>
+              <w:t>13,484</w:t>
             </w:r>
           </w:p>
         </w:tc>
@@ -3210,7 +3304,7 @@
                 <w:i w:val="0"/>
                 <w:sz w:val="18"/>
               </w:rPr>
-              <w:t>5.19</w:t>
+              <w:t>3.47</w:t>
             </w:r>
           </w:p>
         </w:tc>
@@ -3228,7 +3322,7 @@
                 <w:i w:val="0"/>
                 <w:sz w:val="18"/>
               </w:rPr>
-              <w:t>5.71</w:t>
+              <w:t>3.88</w:t>
             </w:r>
           </w:p>
         </w:tc>
@@ -3246,7 +3340,7 @@
                 <w:i w:val="0"/>
                 <w:sz w:val="18"/>
               </w:rPr>
-              <w:t>6.16</w:t>
+              <w:t>4.24</w:t>
             </w:r>
           </w:p>
         </w:tc>
@@ -3264,7 +3358,7 @@
                 <w:i w:val="0"/>
                 <w:sz w:val="18"/>
               </w:rPr>
-              <w:t>6.59</w:t>
+              <w:t>4.58</w:t>
             </w:r>
           </w:p>
         </w:tc>

</xml_diff>